<commit_message>
Elaborated some information in the knowledge base with an extra business rule on the Programmes offered.
</commit_message>
<xml_diff>
--- a/UniFlow_Week3_Progress_Report.docx
+++ b/UniFlow_Week3_Progress_Report.docx
@@ -925,7 +925,19 @@
         <w:spacing w:after="120"/>
       </w:pPr>
       <w:r>
-        <w:t>GitHub commit link(s): [].</w:t>
+        <w:t xml:space="preserve">GitHub </w:t>
+      </w:r>
+      <w:r>
+        <w:t>capstone assignment repo</w:t>
+      </w:r>
+      <w:r>
+        <w:t xml:space="preserve"> link: [</w:t>
+      </w:r>
+      <w:r>
+        <w:t>https://github.com/BSSE-FINAL-YEAR/UniFlow.git</w:t>
+      </w:r>
+      <w:r>
+        <w:t>].</w:t>
       </w:r>
     </w:p>
     <w:p>
@@ -933,10 +945,7 @@
         <w:spacing w:after="120"/>
       </w:pPr>
       <w:r>
-        <w:t>ClickUp</w:t>
-      </w:r>
-      <w:r>
-        <w:t xml:space="preserve"> task link(s): [].</w:t>
+        <w:t>ClickUp task link(s): [].</w:t>
       </w:r>
     </w:p>
     <w:p>

</xml_diff>

<commit_message>
small edits to a  RAG test python file and the week3 progress report
</commit_message>
<xml_diff>
--- a/UniFlow_Week3_Progress_Report.docx
+++ b/UniFlow_Week3_Progress_Report.docx
@@ -63,23 +63,7 @@
         <w:t xml:space="preserve">- </w:t>
       </w:r>
       <w:r>
-        <w:t>injecting the entire approved rule pack into every prompt (</w:t>
-      </w:r>
-      <w:proofErr w:type="spellStart"/>
-      <w:r>
-        <w:t>baseline.py's</w:t>
-      </w:r>
-      <w:proofErr w:type="spellEnd"/>
-      <w:r>
-        <w:t xml:space="preserve"> </w:t>
-      </w:r>
-      <w:proofErr w:type="spellStart"/>
-      <w:r>
-        <w:t>rule_pack</w:t>
-      </w:r>
-      <w:proofErr w:type="spellEnd"/>
-      <w:r>
-        <w:t xml:space="preserve">) </w:t>
+        <w:t xml:space="preserve">injecting the entire approved rule pack into every prompt (baseline.py's rule_pack) </w:t>
       </w:r>
       <w:r>
         <w:t>-</w:t>
@@ -162,13 +146,8 @@
         </w:rPr>
         <w:t xml:space="preserve"> </w:t>
       </w:r>
-      <w:proofErr w:type="spellStart"/>
       <w:r>
-        <w:t>src</w:t>
-      </w:r>
-      <w:proofErr w:type="spellEnd"/>
-      <w:r>
-        <w:t>/rag/ implements ingest → chunk → index → retrieve. ingest.py cross-checks every knowledge/ file against the register and refuses to load on a mismatch either way, the same “two files, always both” discipline Week 2 used for the rule pack. index.py is a hand-rolled BM25 (no new dependency), appropriate for a small, identifier-heavy corpus.</w:t>
+        <w:t>src/rag/ implements ingest → chunk → index → retrieve. ingest.py cross-checks every knowledge/ file against the register and refuses to load on a mismatch either way, the same “two files, always both” discipline Week 2 used for the rule pack. index.py is a hand-rolled BM25 (no new dependency), appropriate for a small, identifier-heavy corpus.</w:t>
       </w:r>
     </w:p>
     <w:p>
@@ -237,15 +216,7 @@
         <w:t xml:space="preserve">- </w:t>
       </w:r>
       <w:r>
-        <w:t>eval/</w:t>
-      </w:r>
-      <w:proofErr w:type="spellStart"/>
-      <w:r>
-        <w:t>rag_eval_cases.json</w:t>
-      </w:r>
-      <w:proofErr w:type="spellEnd"/>
-      <w:r>
-        <w:t xml:space="preserve"> (6 answerable / 4 partially answerable / 5 deliberately unanswerable) run through src/rag_eval_runner.py; verdicts assigned by hand in eval/rag_results_v1.0.csv.</w:t>
+        <w:t>eval/rag_eval_cases.json (6 answerable / 4 partially answerable / 5 deliberately unanswerable) run through src/rag_eval_runner.py; verdicts assigned by hand in eval/rag_results_v1.0.csv.</w:t>
       </w:r>
     </w:p>
     <w:p>
@@ -891,24 +862,28 @@
         <w:t>is</w:t>
       </w:r>
       <w:r>
-        <w:t>ter – Ainebyona Alvin Police</w:t>
+        <w:t>ter –</w:t>
+      </w:r>
+      <w:r>
+        <w:t xml:space="preserve"> </w:t>
+      </w:r>
+      <w:r>
+        <w:t>Swale Sebabe Abdu</w:t>
       </w:r>
       <w:r>
         <w:t>;</w:t>
       </w:r>
       <w:r>
-        <w:t xml:space="preserve"> RAG Architecture diagram – Swale </w:t>
-      </w:r>
-      <w:proofErr w:type="spellStart"/>
-      <w:r>
-        <w:t>Sebabe</w:t>
-      </w:r>
-      <w:proofErr w:type="spellEnd"/>
-      <w:r>
-        <w:t xml:space="preserve"> Abd</w:t>
+        <w:t xml:space="preserve"> RAG Architecture diagram –</w:t>
       </w:r>
       <w:r>
-        <w:t>u;</w:t>
+        <w:t xml:space="preserve"> </w:t>
+      </w:r>
+      <w:r>
+        <w:t>Ainebyona Alvin Police</w:t>
+      </w:r>
+      <w:r>
+        <w:t>;</w:t>
       </w:r>
       <w:r>
         <w:t xml:space="preserve"> </w:t>
@@ -945,7 +920,19 @@
         <w:spacing w:after="120"/>
       </w:pPr>
       <w:r>
-        <w:t>ClickUp task link(s): [].</w:t>
+        <w:t>ClickUp</w:t>
+      </w:r>
+      <w:r>
+        <w:t xml:space="preserve"> Week3</w:t>
+      </w:r>
+      <w:r>
+        <w:t xml:space="preserve"> task link(s): [</w:t>
+      </w:r>
+      <w:r>
+        <w:t>https://app.clickup.com/1200410000004069/v/li/1200410000007523</w:t>
+      </w:r>
+      <w:r>
+        <w:t>].</w:t>
       </w:r>
     </w:p>
     <w:p>

</xml_diff>